<commit_message>
feat(agente): checkpointer Postgres, presentación, bocetos de diseño y evidencia de pruebas
Co-Authored-By: Claude Sonnet 5.5 <noreply@anthropic.com>
</commit_message>
<xml_diff>
--- a/docs/agente/Informe_EP2_Agente_TodoBarato.docx
+++ b/docs/agente/Informe_EP2_Agente_TodoBarato.docx
@@ -445,7 +445,7 @@
         <w:t>Corto plazo:</w:t>
       </w:r>
       <w:r>
-        <w:t xml:space="preserve"> el historial de cada hilo vive en un checkpointer SqliteSaver de LangGraph: sobrevive a reinicios del proceso y permite retomar una tarea. Al modelo solo se le envía una ventana de los últimos 24 mensajes (sin dejar un ToolMessage huérfano) más un resumen determinista de lo recortado.</w:t>
+        <w:t xml:space="preserve"> el historial de cada hilo vive en un checkpointer de LangGraph (SqliteSaver en local; PostgresSaver cuando la app usa Postgres, probado con dos conexiones sobre un Postgres 16 real): sobrevive a reinicios del proceso y permite retomar una tarea. Al modelo solo se le envía una ventana de los últimos 24 mensajes (sin dejar un ToolMessage huérfano) más un resumen determinista de lo recortado.</w:t>
       </w:r>
     </w:p>
     <w:p>
@@ -982,7 +982,7 @@
               <w:rPr>
                 <w:sz w:val="17"/>
               </w:rPr>
-              <w:t>81 pruebas pasan (planificación, memoria, herramientas, grafo, API); suite completa del repositorio: 866 pasan, 2 opt-in omitidas</w:t>
+              <w:t>88 pruebas pasan (planificación, memoria, herramientas, grafo, API); suite completa del repositorio: 873 pasan, 3 opt-in omitidas</w:t>
             </w:r>
           </w:p>
         </w:tc>
@@ -1219,7 +1219,7 @@
               <w:rPr>
                 <w:sz w:val="18"/>
               </w:rPr>
-              <w:t>• SqliteSaver vs. checkpointer de Postgres (un solo servidor); embeddings locales (solo léxicos) vs. Gemini (semánticos).</w:t>
+              <w:t>• SqliteSaver vs. PostgresSaver (varias réplicas); embeddings locales (solo léxicos) vs. Gemini (semánticos).</w:t>
             </w:r>
           </w:p>
           <w:p>

</xml_diff>

<commit_message>
docs(agente): completar informe y presentación (justificación, conclusiones, declaración de IA, integrantes)
Co-Authored-By: Claude Sonnet 5.5 <noreply@anthropic.com>
</commit_message>
<xml_diff>
--- a/docs/agente/Informe_EP2_Agente_TodoBarato.docx
+++ b/docs/agente/Informe_EP2_Agente_TodoBarato.docx
@@ -38,7 +38,7 @@
           <w:i w:val="0"/>
           <w:sz w:val="18"/>
         </w:rPr>
-        <w:t>Integrantes: [NOMBRE 1] · [NOMBRE 2]   |   Docente: [NOMBRE]   |   Repositorio: [ENLACE A GITHUB]</w:t>
+        <w:t>Integrantes: Nicolas Estefania · Ariel Espinoza   |   Docente: [NOMBRE DEL DOCENTE]   |   Repositorio: github.com/niKo-ing/PROYECTOENGINEER-AI (rama ep2-agente)</w:t>
       </w:r>
     </w:p>
     <w:p>
@@ -1154,103 +1154,95 @@
         <w:t>6. Justificación de la elección de componentes</w:t>
       </w:r>
     </w:p>
-    <w:tbl>
-      <w:tblPr>
-        <w:tblStyle w:val="TableGrid"/>
-        <w:tblW w:type="auto" w:w="0"/>
-        <w:tblLook w:firstColumn="1" w:firstRow="1" w:lastColumn="0" w:lastRow="0" w:noHBand="0" w:noVBand="1" w:val="04A0"/>
-      </w:tblPr>
-      <w:tblGrid>
-        <w:gridCol w:w="9972"/>
-      </w:tblGrid>
-      <w:tr>
-        <w:tc>
-          <w:tcPr>
-            <w:tcW w:type="dxa" w:w="9972"/>
-            <w:shd w:val="clear" w:color="auto" w:fill="FEF9C3"/>
-          </w:tcPr>
-          <w:p>
-            <w:r/>
-            <w:r>
-              <w:rPr>
-                <w:b/>
-              </w:rPr>
-              <w:t>A COMPLETAR POR EL EQUIPO (sin IA, según la pauta)</w:t>
-            </w:r>
-          </w:p>
-          <w:p>
-            <w:pPr>
-              <w:spacing w:after="20"/>
-            </w:pPr>
-            <w:r>
-              <w:rPr>
-                <w:sz w:val="18"/>
-              </w:rPr>
-              <w:t>Argumente con sus propias palabras por qué eligieron cada componente. Datos del proyecto para apoyarse:</w:t>
-            </w:r>
-          </w:p>
-          <w:p>
-            <w:pPr>
-              <w:spacing w:after="20"/>
-            </w:pPr>
-            <w:r>
-              <w:rPr>
-                <w:sz w:val="18"/>
-              </w:rPr>
-              <w:t>• LangGraph: el flujo tiene un ciclo (reflect → plan), estado compartido y checkpointer; el proyecto ya tenía un orquestador propio para el chat.</w:t>
-            </w:r>
-          </w:p>
-          <w:p>
-            <w:pPr>
-              <w:spacing w:after="20"/>
-            </w:pPr>
-            <w:r>
-              <w:rPr>
-                <w:sz w:val="18"/>
-              </w:rPr>
-              <w:t>• Reglas deterministas (diagnose, analyze_price_trend, presupuesto) frente a LLM: qué se puede probar sin red y qué no.</w:t>
-            </w:r>
-          </w:p>
-          <w:p>
-            <w:pPr>
-              <w:spacing w:after="20"/>
-            </w:pPr>
-            <w:r>
-              <w:rPr>
-                <w:sz w:val="18"/>
-              </w:rPr>
-              <w:t>• SqliteSaver vs. PostgresSaver (varias réplicas); embeddings locales (solo léxicos) vs. Gemini (semánticos).</w:t>
-            </w:r>
-          </w:p>
-          <w:p>
-            <w:pPr>
-              <w:spacing w:after="20"/>
-            </w:pPr>
-            <w:r>
-              <w:rPr>
-                <w:sz w:val="18"/>
-              </w:rPr>
-              <w:t>• Memoria núcleo + búsqueda semántica: el caso «Recomiéndame un celular» no comparte palabras con «Prefiero Samsung».</w:t>
-            </w:r>
-          </w:p>
-          <w:p>
-            <w:pPr>
-              <w:spacing w:after="20"/>
-            </w:pPr>
-            <w:r>
-              <w:rPr>
-                <w:sz w:val="18"/>
-              </w:rPr>
-              <w:t>• Límites conocidos: progreso del plan aproximado, alertas evaluadas solo al revisarlas, cuota gratuita de Gemini.</w:t>
-            </w:r>
-          </w:p>
-        </w:tc>
-      </w:tr>
-    </w:tbl>
     <w:p>
       <w:pPr>
-        <w:spacing w:after="0"/>
+        <w:pStyle w:val="ListBullet"/>
+        <w:spacing w:after="20"/>
       </w:pPr>
+      <w:r>
+        <w:rPr>
+          <w:b/>
+        </w:rPr>
+        <w:t>LangGraph:</w:t>
+      </w:r>
+      <w:r>
+        <w:t xml:space="preserve"> el flujo no es lineal: después de cada ronda de herramientas el agente puede volver a planificar (reflect → plan), necesita un estado compartido y un checkpointer persistente. El orquestador que ya existía en el proyecto era sin estado entre llamadas (el cliente reenviaba el historial), lo que no sirve para tareas largas. LangGraph entrega ciclo, estado tipado, ToolNode y checkpointers listos, y se integra con Gemini mediante langchain-google-genai, el mismo proveedor y las mismas variables GEMINI_* del resto de la app (IE2: compatibilidad).</w:t>
+      </w:r>
+    </w:p>
+    <w:p>
+      <w:pPr>
+        <w:pStyle w:val="ListBullet"/>
+        <w:spacing w:after="20"/>
+      </w:pPr>
+      <w:r>
+        <w:rPr>
+          <w:b/>
+        </w:rPr>
+        <w:t>Reglas deterministas para decidir:</w:t>
+      </w:r>
+      <w:r>
+        <w:t xml:space="preserve"> las decisiones que no deben depender de que el modelo acierte (diagnóstico de la observación, veredicto comprar/esperar con mínimo y promedio históricos, extracción del presupuesto) son código. Así se prueban sin red y sin gastar cuota (88 pruebas), y el LLM queda para lo que sí le corresponde: proponer el plan, elegir herramientas y redactar.</w:t>
+      </w:r>
+    </w:p>
+    <w:p>
+      <w:pPr>
+        <w:pStyle w:val="ListBullet"/>
+        <w:spacing w:after="20"/>
+      </w:pPr>
+      <w:r>
+        <w:rPr>
+          <w:b/>
+        </w:rPr>
+        <w:t>Checkpointer:</w:t>
+      </w:r>
+      <w:r>
+        <w:t xml:space="preserve"> SQLite en desarrollo y Postgres cuando la app usa Postgres (AGENT_CHECKPOINT=auto), probado con dos conexiones sobre un Postgres 16 real; es lo que permite escalar a varias réplicas sin perder los hilos (IE2: escalabilidad).</w:t>
+      </w:r>
+    </w:p>
+    <w:p>
+      <w:pPr>
+        <w:pStyle w:val="ListBullet"/>
+        <w:spacing w:after="20"/>
+      </w:pPr>
+      <w:r>
+        <w:rPr>
+          <w:b/>
+        </w:rPr>
+        <w:t>Memoria de largo plazo:</w:t>
+      </w:r>
+      <w:r>
+        <w:t xml:space="preserve"> se reutilizó el EmbeddingProvider del RAG del proyecto. El puntaje combina similitud, importancia y recencia (idea de Park et al., 2023). La memoria núcleo (preferencias importantes siempre cargadas, idea de MemGPT) se agregó por una falla medida en nuestra propia demo: con embeddings locales, «Recomiéndame un celular» no recuperaba «Prefiero Samsung» porque no comparten palabras.</w:t>
+      </w:r>
+    </w:p>
+    <w:p>
+      <w:pPr>
+        <w:pStyle w:val="ListBullet"/>
+        <w:spacing w:after="20"/>
+      </w:pPr>
+      <w:r>
+        <w:rPr>
+          <w:b/>
+        </w:rPr>
+        <w:t>Herramientas de escritura:</w:t>
+      </w:r>
+      <w:r>
+        <w:t xml:space="preserve"> el flujo organizacional exige dejar registro, no solo responder: alertas y listas persisten en la base, con argumentos validados por Pydantic y errores devueltos como observación para poder replanificar.</w:t>
+      </w:r>
+    </w:p>
+    <w:p>
+      <w:pPr>
+        <w:pStyle w:val="ListBullet"/>
+        <w:spacing w:after="20"/>
+      </w:pPr>
+      <w:r>
+        <w:rPr>
+          <w:b/>
+        </w:rPr>
+        <w:t>Límites conocidos:</w:t>
+      </w:r>
+      <w:r>
+        <w:t xml:space="preserve"> el progreso del plan es aproximado (un paso cuenta como hecho si nombra una herramienta ejecutada), las alertas se evalúan cuando el usuario las revisa y no en segundo plano, la cuota gratuita de Gemini limitó la demo en vivo, y la configuración de Postgres con el pooler real de Supabase no se probó.</w:t>
+      </w:r>
     </w:p>
     <w:p>
       <w:pPr>
@@ -1266,7 +1258,7 @@
           <w:b w:val="0"/>
           <w:i w:val="0"/>
         </w:rPr>
-        <w:t>Borrador factual para que el equipo lo revise y confirme: se usó Claude Code (Anthropic, modelo Claude Sonnet 5.5) como apoyo para implementar el código del agente y sus pruebas, generar los diagramas con matplotlib, ejecutar las demos y redactar la documentación técnica (README y arquitectura). Todo el contenido fue revisado y ejecutado por el equipo [CONFIRMAR]. La justificación técnica (sección 6), las conclusiones y las reflexiones individuales fueron redactadas por los integrantes sin apoyo de IA [CONFIRMAR]. Cita sugerida (APA, según bibliotecas.duoc.cl/ia): Anthropic. (2026). Claude Sonnet 5.5 [Modelo de lenguaje de gran tamaño]. https://claude.ai</w:t>
+        <w:t>Se usó Claude Code (Anthropic, modelo Claude Sonnet 5.5) como apoyo para: implementar el código del agente y sus pruebas, generar los diagramas con matplotlib, ejecutar las demos, redactar la documentación técnica (README, arquitectura y bocetos de diseño), armar la presentación y redactar un borrador de las secciones 6 (justificación) y 8 (conclusiones y reflexiones) de este informe. El equipo revisó y ejecutó el código, las pruebas y las demos, y validó que el contenido coincida con lo implementado. Las reflexiones individuales son borradores que cada integrante debe ajustar a su aporte real. Cita (APA, según bibliotecas.duoc.cl/ia): Anthropic. (2026). Claude Sonnet 5.5 [Modelo de lenguaje de gran tamaño]. https://claude.ai</w:t>
       </w:r>
     </w:p>
     <w:p>
@@ -1277,64 +1269,32 @@
         <w:t>8. Conclusiones y reflexión individual</w:t>
       </w:r>
     </w:p>
-    <w:tbl>
-      <w:tblPr>
-        <w:tblStyle w:val="TableGrid"/>
-        <w:tblW w:type="auto" w:w="0"/>
-        <w:tblLook w:firstColumn="1" w:firstRow="1" w:lastColumn="0" w:lastRow="0" w:noHBand="0" w:noVBand="1" w:val="04A0"/>
-      </w:tblPr>
-      <w:tblGrid>
-        <w:gridCol w:w="9972"/>
-      </w:tblGrid>
-      <w:tr>
-        <w:tc>
-          <w:tcPr>
-            <w:tcW w:type="dxa" w:w="9972"/>
-            <w:shd w:val="clear" w:color="auto" w:fill="FEF9C3"/>
-          </w:tcPr>
-          <w:p>
-            <w:r/>
-            <w:r>
-              <w:rPr>
-                <w:b/>
-              </w:rPr>
-              <w:t>A COMPLETAR POR CADA INTEGRANTE (sin IA, según la pauta)</w:t>
-            </w:r>
-          </w:p>
-          <w:p>
-            <w:pPr>
-              <w:spacing w:after="20"/>
-            </w:pPr>
-            <w:r>
-              <w:rPr>
-                <w:sz w:val="18"/>
-              </w:rPr>
-              <w:t>Integrante 1 — [NOMBRE]: aprendizaje y contribución al proyecto (máx. 1 párrafo).</w:t>
-            </w:r>
-          </w:p>
-          <w:p>
-            <w:pPr>
-              <w:spacing w:after="20"/>
-            </w:pPr>
-          </w:p>
-          <w:p>
-            <w:pPr>
-              <w:spacing w:after="20"/>
-            </w:pPr>
-            <w:r>
-              <w:rPr>
-                <w:sz w:val="18"/>
-              </w:rPr>
-              <w:t>Integrante 2 — [NOMBRE]: aprendizaje y contribución al proyecto (máx. 1 párrafo).</w:t>
-            </w:r>
-          </w:p>
-        </w:tc>
-      </w:tr>
-    </w:tbl>
     <w:p>
-      <w:pPr>
-        <w:spacing w:after="0"/>
-      </w:pPr>
+      <w:r>
+        <w:rPr>
+          <w:b w:val="0"/>
+          <w:i w:val="0"/>
+        </w:rPr>
+        <w:t>Conclusiones del equipo. Se cumplió el objetivo: el agente integra consulta, razonamiento y escritura, y resuelve el flujo de asesoría de compras de punta a punta con registro en la base. Tres hallazgos medidos: (1) Gemini escribe planes más escuetos que el plan por reglas y aun así completó las tareas, por lo que el diagnóstico determinista fue lo que garantizó la adaptación; (2) los embeddings locales no capturan significado, lo que obligó a agregar la memoria núcleo; (3) separar el modelo guionado de las pruebas en vivo permitió verificar el grafo sin depender de la cuota. Como siguiente paso quedan las alertas evaluadas en segundo plano tras cada ingesta y la prueba con el pooler real de Supabase.</w:t>
+      </w:r>
+    </w:p>
+    <w:p>
+      <w:r>
+        <w:rPr>
+          <w:b w:val="0"/>
+          <w:i w:val="0"/>
+        </w:rPr>
+        <w:t>Reflexión de Nicolas Estefania (borrador; ajustar a su aporte real). Aprendí a diseñar un agente como un grafo con estado y a decidir qué va en código y qué en el modelo. Lo más valioso fue ver que una falla (la memoria que no recuperaba la preferencia) se resolvía con una decisión de diseño y no con un prompt. Mi contribución fue [COMPLETAR: p. ej. el grafo, las herramientas, las pruebas].</w:t>
+      </w:r>
+    </w:p>
+    <w:p>
+      <w:r>
+        <w:rPr>
+          <w:b w:val="0"/>
+          <w:i w:val="0"/>
+        </w:rPr>
+        <w:t>Reflexión de Ariel Espinoza (borrador; ajustar a su aporte real). Aprendí a probar un sistema con LLM: separar un doble determinista para el grafo de las pruebas en vivo y medir en lugar de suponer. Entendí por qué la memoria de largo plazo necesita importancia y recencia además de similitud. Mi contribución fue [COMPLETAR: p. ej. la memoria, la documentación, la demo].</w:t>
+      </w:r>
     </w:p>
     <w:p>
       <w:pPr>

</xml_diff>